<commit_message>
Fix individual letter generation for deactivated clients and clear cancelation date in proempresa template
</commit_message>
<xml_diff>
--- a/MODELO DE CARTA DE PROEMPRESA.docx
+++ b/MODELO DE CARTA DE PROEMPRESA.docx
@@ -11,29 +11,7 @@
         <w:spacing w:before="0" w:after="0" w:line="276" w:lineRule="auto"/>
       </w:pPr>
       <w:r>
-        <w:t xml:space="preserve">                                                                               Lima        </w:t>
-      </w:r>
-      <w:proofErr w:type="gramStart"/>
-      <w:r>
-        <w:t xml:space="preserve">  </w:t>
-      </w:r>
-      <w:r>
-        <w:t>,</w:t>
-      </w:r>
-      <w:proofErr w:type="gramEnd"/>
-      <w:r>
-        <w:t xml:space="preserve"> </w:t>
-      </w:r>
-      <w:r>
-        <w:t xml:space="preserve">de                 </w:t>
-      </w:r>
-      <w:proofErr w:type="spellStart"/>
-      <w:r>
-        <w:t>de</w:t>
-      </w:r>
-      <w:proofErr w:type="spellEnd"/>
-      <w:r>
-        <w:t xml:space="preserve"> 2026</w:t>
+        <w:t xml:space="preserve">                                                                               Lima, [FECHA_ACTUAL]</w:t>
       </w:r>
     </w:p>
     <w:p>
@@ -134,21 +112,7 @@
         </w:rPr>
       </w:pPr>
       <w:r>
-        <w:rPr>
-          <w:rFonts w:ascii="Arial Narrow" w:hAnsi="Arial Narrow"/>
-          <w:bCs/>
-          <w:szCs w:val="18"/>
-        </w:rPr>
-        <w:t xml:space="preserve">SEÑOR (A) (ES): </w:t>
-      </w:r>
-      <w:r>
-        <w:rPr>
-          <w:rFonts w:ascii="Arial Narrow" w:hAnsi="Arial Narrow"/>
-          <w:b/>
-          <w:noProof/>
-          <w:sz w:val="36"/>
-        </w:rPr>
-        <w:t>MERINO TRILLO ILBER</w:t>
+        <w:t>SEÑOR (A) (ES): [NOMBRE_CLIENTE]</w:t>
       </w:r>
     </w:p>
     <w:p>
@@ -159,38 +123,18 @@
         </w:rPr>
       </w:pPr>
       <w:r>
+        <w:t>CUENTA:[NUM_CUENTA]</w:t>
+      </w:r>
+    </w:p>
+    <w:p>
+      <w:pPr>
+        <w:spacing w:after="0"/>
         <w:rPr>
           <w:lang w:eastAsia="es-ES"/>
         </w:rPr>
-        <w:t>CUENTA:</w:t>
-      </w:r>
-      <w:r>
-        <w:rPr>
-          <w:noProof/>
-          <w:lang w:eastAsia="es-ES"/>
-        </w:rPr>
-        <w:t>098785010045895941</w:t>
-      </w:r>
-    </w:p>
-    <w:p>
-      <w:pPr>
-        <w:spacing w:after="0"/>
-        <w:rPr>
-          <w:lang w:eastAsia="es-ES"/>
-        </w:rPr>
-      </w:pPr>
-      <w:r>
-        <w:rPr>
-          <w:lang w:val="pt-BR"/>
-        </w:rPr>
-        <w:t xml:space="preserve">CONYUGE: </w:t>
-      </w:r>
-      <w:r>
-        <w:rPr>
-          <w:noProof/>
-          <w:lang w:val="pt-BR"/>
-        </w:rPr>
-        <w:t>CARRASCO RUIZ JACQUELINE ASTRID</w:t>
+      </w:pPr>
+      <w:r>
+        <w:t>CONYUGE: [CONYUGE_CLIENTE]</w:t>
       </w:r>
     </w:p>
     <w:p>
@@ -205,6 +149,12 @@
         </w:rPr>
       </w:pPr>
       <w:r>
+        <w:t>DOMICILIO: [DIRECCION_CLIENTE]</w:t>
+      </w:r>
+    </w:p>
+    <w:p>
+      <w:pPr>
+        <w:spacing w:after="0" w:line="240" w:lineRule="auto"/>
         <w:rPr>
           <w:rFonts w:ascii="Arial Narrow" w:hAnsi="Arial Narrow" w:cs="Arial"/>
           <w:bCs/>
@@ -212,61 +162,6 @@
           <w:szCs w:val="18"/>
           <w:lang w:val="pt-BR"/>
         </w:rPr>
-        <w:t>DOMICILIO:</w:t>
-      </w:r>
-      <w:r>
-        <w:rPr>
-          <w:rFonts w:ascii="Arial Narrow" w:hAnsi="Arial Narrow" w:cs="Arial"/>
-          <w:bCs/>
-          <w:sz w:val="24"/>
-          <w:szCs w:val="18"/>
-          <w:lang w:val="pt-BR"/>
-        </w:rPr>
-        <w:t xml:space="preserve"> </w:t>
-      </w:r>
-      <w:r>
-        <w:rPr>
-          <w:rFonts w:ascii="Arial Narrow" w:hAnsi="Arial Narrow" w:cs="Arial"/>
-          <w:bCs/>
-          <w:noProof/>
-          <w:sz w:val="24"/>
-          <w:szCs w:val="18"/>
-          <w:lang w:val="pt-BR"/>
-        </w:rPr>
-        <w:t>CALLE LOS FRUTALES Lt 55 ASENTAMIENTO HUMANO HUAYCAN ETAPA 4 ZONA N UCV 175 - ATE VITARTE - LIMA - LIMA</w:t>
-      </w:r>
-      <w:r>
-        <w:rPr>
-          <w:rFonts w:ascii="Arial Narrow" w:hAnsi="Arial Narrow" w:cs="Arial"/>
-          <w:bCs/>
-          <w:sz w:val="24"/>
-          <w:szCs w:val="18"/>
-          <w:lang w:val="pt-BR"/>
-        </w:rPr>
-        <w:t xml:space="preserve"> </w:t>
-      </w:r>
-      <w:r>
-        <w:rPr>
-          <w:rFonts w:ascii="Arial Narrow" w:hAnsi="Arial Narrow" w:cs="Arial"/>
-          <w:bCs/>
-          <w:noProof/>
-          <w:sz w:val="24"/>
-          <w:szCs w:val="18"/>
-          <w:lang w:val="pt-BR"/>
-        </w:rPr>
-        <w:t>ATE</w:t>
-      </w:r>
-    </w:p>
-    <w:p>
-      <w:pPr>
-        <w:spacing w:after="0" w:line="240" w:lineRule="auto"/>
-        <w:rPr>
-          <w:rFonts w:ascii="Arial Narrow" w:hAnsi="Arial Narrow" w:cs="Arial"/>
-          <w:bCs/>
-          <w:sz w:val="24"/>
-          <w:szCs w:val="18"/>
-          <w:lang w:val="pt-BR"/>
-        </w:rPr>
       </w:pPr>
     </w:p>
     <w:p>
@@ -280,70 +175,21 @@
         </w:rPr>
       </w:pPr>
       <w:r>
+        <w:t>AVAL: [NOMBRE_AVAL]</w:t>
+      </w:r>
+    </w:p>
+    <w:p>
+      <w:pPr>
+        <w:spacing w:after="0" w:line="240" w:lineRule="auto"/>
         <w:rPr>
           <w:rFonts w:ascii="Arial Narrow" w:hAnsi="Arial Narrow"/>
           <w:bCs/>
           <w:noProof/>
           <w:szCs w:val="18"/>
         </w:rPr>
-        <w:t>AVAL</w:t>
-      </w:r>
-      <w:r>
-        <w:rPr>
-          <w:rFonts w:ascii="Arial Narrow" w:hAnsi="Arial Narrow"/>
-          <w:bCs/>
-          <w:noProof/>
-          <w:szCs w:val="18"/>
-        </w:rPr>
-        <w:t>:</w:t>
-      </w:r>
-      <w:r>
-        <w:rPr>
-          <w:rFonts w:ascii="Arial Narrow" w:hAnsi="Arial Narrow"/>
-          <w:bCs/>
-          <w:noProof/>
-          <w:szCs w:val="18"/>
-        </w:rPr>
-        <w:t xml:space="preserve"> </w:t>
-      </w:r>
-      <w:r>
-        <w:rPr>
-          <w:rFonts w:ascii="Arial Narrow" w:hAnsi="Arial Narrow"/>
-          <w:b/>
-          <w:noProof/>
-          <w:szCs w:val="18"/>
-        </w:rPr>
-        <w:t xml:space="preserve"> </w:t>
-      </w:r>
-    </w:p>
-    <w:p>
-      <w:pPr>
-        <w:spacing w:after="0" w:line="240" w:lineRule="auto"/>
-        <w:rPr>
-          <w:rFonts w:ascii="Arial Narrow" w:hAnsi="Arial Narrow"/>
-          <w:bCs/>
-          <w:noProof/>
-          <w:szCs w:val="18"/>
-        </w:rPr>
-      </w:pPr>
-      <w:r>
-        <w:rPr>
-          <w:rFonts w:ascii="Arial Narrow" w:hAnsi="Arial Narrow" w:cs="Arial"/>
-          <w:bCs/>
-          <w:sz w:val="24"/>
-          <w:szCs w:val="18"/>
-          <w:lang w:val="pt-BR"/>
-        </w:rPr>
-        <w:t>DOMICILIO:</w:t>
-      </w:r>
-      <w:r>
-        <w:rPr>
-          <w:rFonts w:ascii="Arial Narrow" w:hAnsi="Arial Narrow"/>
-          <w:bCs/>
-          <w:noProof/>
-          <w:szCs w:val="18"/>
-        </w:rPr>
-        <w:t xml:space="preserve"> </w:t>
+      </w:pPr>
+      <w:r>
+        <w:t>DOMICILIO AVAL: [DOMICILIO_AVAL]</w:t>
       </w:r>
     </w:p>
     <w:p>
@@ -376,33 +222,7 @@
         </w:rPr>
       </w:pPr>
       <w:r>
-        <w:rPr>
-          <w:rFonts w:ascii="Arial Narrow" w:hAnsi="Arial Narrow" w:cs="Arial"/>
-          <w:bCs/>
-          <w:sz w:val="24"/>
-          <w:szCs w:val="18"/>
-          <w:lang w:val="pt-BR"/>
-        </w:rPr>
-        <w:t>A</w:t>
-      </w:r>
-      <w:r>
-        <w:rPr>
-          <w:rFonts w:ascii="Arial Narrow" w:hAnsi="Arial Narrow" w:cs="Arial"/>
-          <w:bCs/>
-          <w:sz w:val="24"/>
-          <w:szCs w:val="18"/>
-        </w:rPr>
-        <w:t xml:space="preserve">GENCIA: </w:t>
-      </w:r>
-      <w:r>
-        <w:rPr>
-          <w:rFonts w:ascii="Arial Narrow" w:hAnsi="Arial Narrow" w:cs="Arial"/>
-          <w:bCs/>
-          <w:noProof/>
-          <w:sz w:val="24"/>
-          <w:szCs w:val="18"/>
-        </w:rPr>
-        <w:t>AGENCIA COMERCIAL</w:t>
+        <w:t>AGENCIA: [AGENCIA]</w:t>
       </w:r>
     </w:p>
     <w:p>
@@ -592,22 +412,7 @@
         </w:rPr>
       </w:pPr>
       <w:r>
-        <w:rPr>
-          <w:rFonts w:ascii="Arial Narrow" w:eastAsia="Times New Roman" w:hAnsi="Arial Narrow" w:cs="Arial"/>
-          <w:b/>
-          <w:sz w:val="24"/>
-          <w:lang w:val="es-ES"/>
-        </w:rPr>
-        <w:t>CANCELACIÓN HASTA EL</w:t>
-      </w:r>
-      <w:r>
-        <w:rPr>
-          <w:rFonts w:ascii="Arial Narrow" w:eastAsia="Times New Roman" w:hAnsi="Arial Narrow" w:cs="Arial"/>
-          <w:b/>
-          <w:sz w:val="24"/>
-          <w:lang w:val="es-ES"/>
-        </w:rPr>
-        <w:t xml:space="preserve"> </w:t>
+        <w:t xml:space="preserve">CANCELACIÓN HASTA EL:                                                </w:t>
       </w:r>
     </w:p>
     <w:p>
@@ -1260,21 +1065,7 @@
         </w:rPr>
       </w:pPr>
       <w:r>
-        <w:rPr>
-          <w:rFonts w:ascii="Arial Narrow" w:hAnsi="Arial Narrow"/>
-          <w:bCs/>
-          <w:szCs w:val="18"/>
-        </w:rPr>
-        <w:t xml:space="preserve">SEÑOR (A) (ES): </w:t>
-      </w:r>
-      <w:r>
-        <w:rPr>
-          <w:rFonts w:ascii="Arial Narrow" w:hAnsi="Arial Narrow"/>
-          <w:b/>
-          <w:noProof/>
-          <w:sz w:val="36"/>
-        </w:rPr>
-        <w:t>MERINO TRILLO ILBER</w:t>
+        <w:t>SEÑOR (A) (ES): [NOMBRE_CLIENTE]</w:t>
       </w:r>
     </w:p>
     <w:p>
@@ -1285,38 +1076,18 @@
         </w:rPr>
       </w:pPr>
       <w:r>
+        <w:t>CUENTA:[NUM_CUENTA]</w:t>
+      </w:r>
+    </w:p>
+    <w:p>
+      <w:pPr>
+        <w:spacing w:after="0"/>
         <w:rPr>
           <w:lang w:eastAsia="es-ES"/>
         </w:rPr>
-        <w:t>CUENTA:</w:t>
-      </w:r>
-      <w:r>
-        <w:rPr>
-          <w:noProof/>
-          <w:lang w:eastAsia="es-ES"/>
-        </w:rPr>
-        <w:t>098785010045895941</w:t>
-      </w:r>
-    </w:p>
-    <w:p>
-      <w:pPr>
-        <w:spacing w:after="0"/>
-        <w:rPr>
-          <w:lang w:eastAsia="es-ES"/>
-        </w:rPr>
-      </w:pPr>
-      <w:r>
-        <w:rPr>
-          <w:lang w:val="pt-BR"/>
-        </w:rPr>
-        <w:t xml:space="preserve">CONYUGE: </w:t>
-      </w:r>
-      <w:r>
-        <w:rPr>
-          <w:noProof/>
-          <w:lang w:val="pt-BR"/>
-        </w:rPr>
-        <w:t>CARRASCO RUIZ JACQUELINE ASTRID</w:t>
+      </w:pPr>
+      <w:r>
+        <w:t>CONYUGE: [CONYUGE_CLIENTE]</w:t>
       </w:r>
     </w:p>
     <w:p>
@@ -1331,6 +1102,12 @@
         </w:rPr>
       </w:pPr>
       <w:r>
+        <w:t>DOMICILIO: [DIRECCION_CLIENTE]</w:t>
+      </w:r>
+    </w:p>
+    <w:p>
+      <w:pPr>
+        <w:spacing w:after="0" w:line="240" w:lineRule="auto"/>
         <w:rPr>
           <w:rFonts w:ascii="Arial Narrow" w:hAnsi="Arial Narrow" w:cs="Arial"/>
           <w:bCs/>
@@ -1338,61 +1115,6 @@
           <w:szCs w:val="18"/>
           <w:lang w:val="pt-BR"/>
         </w:rPr>
-        <w:t>DOMICILIO:</w:t>
-      </w:r>
-      <w:r>
-        <w:rPr>
-          <w:rFonts w:ascii="Arial Narrow" w:hAnsi="Arial Narrow" w:cs="Arial"/>
-          <w:bCs/>
-          <w:sz w:val="24"/>
-          <w:szCs w:val="18"/>
-          <w:lang w:val="pt-BR"/>
-        </w:rPr>
-        <w:t xml:space="preserve"> </w:t>
-      </w:r>
-      <w:r>
-        <w:rPr>
-          <w:rFonts w:ascii="Arial Narrow" w:hAnsi="Arial Narrow" w:cs="Arial"/>
-          <w:bCs/>
-          <w:noProof/>
-          <w:sz w:val="24"/>
-          <w:szCs w:val="18"/>
-          <w:lang w:val="pt-BR"/>
-        </w:rPr>
-        <w:t>CALLE LOS FRUTALES Lt 55 ASENTAMIENTO HUMANO HUAYCAN ETAPA 4 ZONA N UCV 175 - ATE VITARTE - LIMA - LIMA</w:t>
-      </w:r>
-      <w:r>
-        <w:rPr>
-          <w:rFonts w:ascii="Arial Narrow" w:hAnsi="Arial Narrow" w:cs="Arial"/>
-          <w:bCs/>
-          <w:sz w:val="24"/>
-          <w:szCs w:val="18"/>
-          <w:lang w:val="pt-BR"/>
-        </w:rPr>
-        <w:t xml:space="preserve"> </w:t>
-      </w:r>
-      <w:r>
-        <w:rPr>
-          <w:rFonts w:ascii="Arial Narrow" w:hAnsi="Arial Narrow" w:cs="Arial"/>
-          <w:bCs/>
-          <w:noProof/>
-          <w:sz w:val="24"/>
-          <w:szCs w:val="18"/>
-          <w:lang w:val="pt-BR"/>
-        </w:rPr>
-        <w:t>ATE</w:t>
-      </w:r>
-    </w:p>
-    <w:p>
-      <w:pPr>
-        <w:spacing w:after="0" w:line="240" w:lineRule="auto"/>
-        <w:rPr>
-          <w:rFonts w:ascii="Arial Narrow" w:hAnsi="Arial Narrow" w:cs="Arial"/>
-          <w:bCs/>
-          <w:sz w:val="24"/>
-          <w:szCs w:val="18"/>
-          <w:lang w:val="pt-BR"/>
-        </w:rPr>
       </w:pPr>
     </w:p>
     <w:p>
@@ -1406,70 +1128,21 @@
         </w:rPr>
       </w:pPr>
       <w:r>
+        <w:t>AVAL: [NOMBRE_AVAL]</w:t>
+      </w:r>
+    </w:p>
+    <w:p>
+      <w:pPr>
+        <w:spacing w:after="0" w:line="240" w:lineRule="auto"/>
         <w:rPr>
           <w:rFonts w:ascii="Arial Narrow" w:hAnsi="Arial Narrow"/>
           <w:bCs/>
           <w:noProof/>
           <w:szCs w:val="18"/>
         </w:rPr>
-        <w:t>AVAL</w:t>
-      </w:r>
-      <w:r>
-        <w:rPr>
-          <w:rFonts w:ascii="Arial Narrow" w:hAnsi="Arial Narrow"/>
-          <w:bCs/>
-          <w:noProof/>
-          <w:szCs w:val="18"/>
-        </w:rPr>
-        <w:t>:</w:t>
-      </w:r>
-      <w:r>
-        <w:rPr>
-          <w:rFonts w:ascii="Arial Narrow" w:hAnsi="Arial Narrow"/>
-          <w:bCs/>
-          <w:noProof/>
-          <w:szCs w:val="18"/>
-        </w:rPr>
-        <w:t xml:space="preserve"> </w:t>
-      </w:r>
-      <w:r>
-        <w:rPr>
-          <w:rFonts w:ascii="Arial Narrow" w:hAnsi="Arial Narrow"/>
-          <w:b/>
-          <w:noProof/>
-          <w:szCs w:val="18"/>
-        </w:rPr>
-        <w:t xml:space="preserve"> </w:t>
-      </w:r>
-    </w:p>
-    <w:p>
-      <w:pPr>
-        <w:spacing w:after="0" w:line="240" w:lineRule="auto"/>
-        <w:rPr>
-          <w:rFonts w:ascii="Arial Narrow" w:hAnsi="Arial Narrow"/>
-          <w:bCs/>
-          <w:noProof/>
-          <w:szCs w:val="18"/>
-        </w:rPr>
-      </w:pPr>
-      <w:r>
-        <w:rPr>
-          <w:rFonts w:ascii="Arial Narrow" w:hAnsi="Arial Narrow" w:cs="Arial"/>
-          <w:bCs/>
-          <w:sz w:val="24"/>
-          <w:szCs w:val="18"/>
-          <w:lang w:val="pt-BR"/>
-        </w:rPr>
-        <w:t>DOMICILIO:</w:t>
-      </w:r>
-      <w:r>
-        <w:rPr>
-          <w:rFonts w:ascii="Arial Narrow" w:hAnsi="Arial Narrow"/>
-          <w:bCs/>
-          <w:noProof/>
-          <w:szCs w:val="18"/>
-        </w:rPr>
-        <w:t xml:space="preserve"> </w:t>
+      </w:pPr>
+      <w:r>
+        <w:t>DOMICILIO AVAL: [DOMICILIO_AVAL]</w:t>
       </w:r>
     </w:p>
     <w:p>
@@ -1502,33 +1175,7 @@
         </w:rPr>
       </w:pPr>
       <w:r>
-        <w:rPr>
-          <w:rFonts w:ascii="Arial Narrow" w:hAnsi="Arial Narrow" w:cs="Arial"/>
-          <w:bCs/>
-          <w:sz w:val="24"/>
-          <w:szCs w:val="18"/>
-          <w:lang w:val="pt-BR"/>
-        </w:rPr>
-        <w:t>A</w:t>
-      </w:r>
-      <w:r>
-        <w:rPr>
-          <w:rFonts w:ascii="Arial Narrow" w:hAnsi="Arial Narrow" w:cs="Arial"/>
-          <w:bCs/>
-          <w:sz w:val="24"/>
-          <w:szCs w:val="18"/>
-        </w:rPr>
-        <w:t xml:space="preserve">GENCIA: </w:t>
-      </w:r>
-      <w:r>
-        <w:rPr>
-          <w:rFonts w:ascii="Arial Narrow" w:hAnsi="Arial Narrow" w:cs="Arial"/>
-          <w:bCs/>
-          <w:noProof/>
-          <w:sz w:val="24"/>
-          <w:szCs w:val="18"/>
-        </w:rPr>
-        <w:t>AGENCIA COMERCIAL</w:t>
+        <w:t>AGENCIA: [AGENCIA]</w:t>
       </w:r>
     </w:p>
     <w:p>
@@ -1718,40 +1365,7 @@
         </w:rPr>
       </w:pPr>
       <w:r>
-        <w:rPr>
-          <w:rFonts w:ascii="Arial Narrow" w:eastAsia="Times New Roman" w:hAnsi="Arial Narrow" w:cs="Arial"/>
-          <w:b/>
-          <w:sz w:val="24"/>
-          <w:lang w:val="es-ES"/>
-        </w:rPr>
-        <w:t xml:space="preserve">CANCELACIÓN HASTA EL </w:t>
-      </w:r>
-      <w:r>
-        <w:rPr>
-          <w:rFonts w:ascii="Arial Narrow" w:eastAsia="Times New Roman" w:hAnsi="Arial Narrow" w:cs="Arial"/>
-          <w:b/>
-          <w:sz w:val="24"/>
-          <w:lang w:val="es-ES"/>
-        </w:rPr>
-        <w:t>27/01/</w:t>
-      </w:r>
-      <w:r>
-        <w:rPr>
-          <w:rFonts w:ascii="Arial Narrow" w:eastAsia="Times New Roman" w:hAnsi="Arial Narrow" w:cs="Arial"/>
-          <w:b/>
-          <w:sz w:val="24"/>
-          <w:lang w:val="es-ES"/>
-        </w:rPr>
-        <w:t>202</w:t>
-      </w:r>
-      <w:r>
-        <w:rPr>
-          <w:rFonts w:ascii="Arial Narrow" w:eastAsia="Times New Roman" w:hAnsi="Arial Narrow" w:cs="Arial"/>
-          <w:b/>
-          <w:sz w:val="24"/>
-          <w:lang w:val="es-ES"/>
-        </w:rPr>
-        <w:t>6</w:t>
+        <w:t xml:space="preserve">CANCELACIÓN HASTA EL:                                                </w:t>
       </w:r>
     </w:p>
     <w:p>
@@ -2417,6 +2031,21 @@
           <w:lang w:eastAsia="es-ES"/>
         </w:rPr>
       </w:pPr>
+    </w:p>
+    <w:p>
+      <w:r>
+        <w:t>Negocio: [DIR_NEGOCIO]     Tipo de PROCESO: [TIPO_PROCESO]</w:t>
+      </w:r>
+    </w:p>
+    <w:p>
+      <w:r>
+        <w:t>Teléfono de cliente: [TELEFONO_CLIENTE]</w:t>
+      </w:r>
+    </w:p>
+    <w:p>
+      <w:r>
+        <w:t>Fecha de pago: [FECHA_ULT_PAGO]</w:t>
+      </w:r>
     </w:p>
     <w:sectPr>
       <w:headerReference w:type="default" r:id="rId9"/>

</xml_diff>

<commit_message>
Fix layout and text of ProEmpresa template
</commit_message>
<xml_diff>
--- a/MODELO DE CARTA DE PROEMPRESA.docx
+++ b/MODELO DE CARTA DE PROEMPRESA.docx
@@ -11,7 +11,7 @@
         <w:spacing w:before="0" w:after="0" w:line="276" w:lineRule="auto"/>
       </w:pPr>
       <w:r>
-        <w:t xml:space="preserve">                                                                               Lima, [FECHA_ACTUAL]</w:t>
+        <w:t xml:space="preserve">                                                                               Lima,                                           </w:t>
       </w:r>
     </w:p>
     <w:p>
@@ -112,6 +112,10 @@
         </w:rPr>
       </w:pPr>
       <w:r>
+        <w:rPr>
+          <w:b/>
+          <w:sz w:val="28"/>
+        </w:rPr>
         <w:t>SEÑOR (A) (ES): [NOMBRE_CLIENTE]</w:t>
       </w:r>
     </w:p>
@@ -134,6 +138,10 @@
         </w:rPr>
       </w:pPr>
       <w:r>
+        <w:rPr>
+          <w:b/>
+          <w:sz w:val="24"/>
+        </w:rPr>
         <w:t>CONYUGE: [CONYUGE_CLIENTE]</w:t>
       </w:r>
     </w:p>
@@ -946,31 +954,7 @@
         <w:jc w:val="right"/>
       </w:pPr>
       <w:r>
-        <w:t xml:space="preserve">     Lima        </w:t>
-      </w:r>
-      <w:proofErr w:type="gramStart"/>
-      <w:r>
-        <w:t xml:space="preserve">  </w:t>
-      </w:r>
-      <w:r>
-        <w:t>,</w:t>
-      </w:r>
-      <w:proofErr w:type="gramEnd"/>
-      <w:r>
-        <w:t xml:space="preserve"> </w:t>
-      </w:r>
-      <w:r>
-        <w:t xml:space="preserve">de                 </w:t>
-      </w:r>
-      <w:proofErr w:type="spellStart"/>
-      <w:r>
-        <w:t>de</w:t>
-      </w:r>
-      <w:proofErr w:type="spellEnd"/>
-      <w:r>
-        <w:t xml:space="preserve"> 2025</w:t>
-      </w:r>
-      <w:r>
+        <w:t xml:space="preserve">     Lima,                                           </w:t>
         <w:tab/>
       </w:r>
     </w:p>
@@ -1065,6 +1049,10 @@
         </w:rPr>
       </w:pPr>
       <w:r>
+        <w:rPr>
+          <w:b/>
+          <w:sz w:val="28"/>
+        </w:rPr>
         <w:t>SEÑOR (A) (ES): [NOMBRE_CLIENTE]</w:t>
       </w:r>
     </w:p>
@@ -1087,6 +1075,10 @@
         </w:rPr>
       </w:pPr>
       <w:r>
+        <w:rPr>
+          <w:b/>
+          <w:sz w:val="24"/>
+        </w:rPr>
         <w:t>CONYUGE: [CONYUGE_CLIENTE]</w:t>
       </w:r>
     </w:p>
@@ -1785,252 +1777,19 @@
           <w:szCs w:val="32"/>
         </w:rPr>
       </w:pPr>
-      <w:r>
+      <w:r/>
+    </w:p>
+    <w:p>
+      <w:pPr>
         <w:rPr>
           <w:rFonts w:ascii="Arial Narrow" w:hAnsi="Arial Narrow" w:cs="Calibri Light"/>
           <w:b/>
           <w:bCs/>
-          <w:sz w:val="32"/>
-          <w:szCs w:val="32"/>
-        </w:rPr>
-        <w:t xml:space="preserve">Negocio: </w:t>
-      </w:r>
-      <w:r>
-        <w:rPr>
-          <w:rFonts w:ascii="Arial Narrow" w:hAnsi="Arial Narrow" w:cs="Calibri Light"/>
-          <w:b/>
-          <w:bCs/>
-          <w:noProof/>
-          <w:sz w:val="32"/>
-          <w:szCs w:val="32"/>
-        </w:rPr>
-        <w:t xml:space="preserve">CALLE LOS FRUTALES Lt 55 ASENTAMIENTO HUMANO HUAYCAN ETAPA 4 ZONA N UCV </w:t>
-      </w:r>
-      <w:proofErr w:type="gramStart"/>
-      <w:r>
-        <w:rPr>
-          <w:rFonts w:ascii="Arial Narrow" w:hAnsi="Arial Narrow" w:cs="Calibri Light"/>
-          <w:b/>
-          <w:bCs/>
-          <w:noProof/>
-          <w:sz w:val="32"/>
-          <w:szCs w:val="32"/>
-        </w:rPr>
-        <w:t>175</w:t>
-      </w:r>
-      <w:r>
-        <w:rPr>
-          <w:rFonts w:ascii="Arial Narrow" w:hAnsi="Arial Narrow" w:cs="Calibri Light"/>
-          <w:b/>
-          <w:bCs/>
-          <w:sz w:val="32"/>
-          <w:szCs w:val="32"/>
-        </w:rPr>
-        <w:t xml:space="preserve">  Tipo</w:t>
-      </w:r>
-      <w:proofErr w:type="gramEnd"/>
-      <w:r>
-        <w:rPr>
-          <w:rFonts w:ascii="Arial Narrow" w:hAnsi="Arial Narrow" w:cs="Calibri Light"/>
-          <w:b/>
-          <w:bCs/>
-          <w:sz w:val="32"/>
-          <w:szCs w:val="32"/>
-        </w:rPr>
-        <w:t xml:space="preserve"> de PROCESO: </w:t>
-      </w:r>
-      <w:r>
-        <w:rPr>
-          <w:rFonts w:ascii="Arial Narrow" w:hAnsi="Arial Narrow" w:cs="Calibri Light"/>
-          <w:b/>
-          <w:bCs/>
-          <w:noProof/>
-          <w:sz w:val="32"/>
-          <w:szCs w:val="32"/>
-        </w:rPr>
-        <w:t>MCFP Exclusiva (MCEX)</w:t>
-      </w:r>
-    </w:p>
-    <w:p>
-      <w:pPr>
-        <w:rPr>
-          <w:rFonts w:ascii="Arial Narrow" w:hAnsi="Arial Narrow" w:cs="Calibri Light"/>
-          <w:b/>
-          <w:bCs/>
-          <w:sz w:val="28"/>
-          <w:szCs w:val="28"/>
-        </w:rPr>
-      </w:pPr>
-      <w:r>
-        <w:rPr>
-          <w:rFonts w:ascii="Arial Narrow" w:hAnsi="Arial Narrow" w:cs="Calibri Light"/>
-          <w:b/>
-          <w:bCs/>
-          <w:sz w:val="28"/>
-          <w:szCs w:val="28"/>
-        </w:rPr>
-        <w:t xml:space="preserve">Teléfono de cliente: </w:t>
-      </w:r>
-      <w:r>
-        <w:rPr>
-          <w:rFonts w:ascii="Arial Narrow" w:hAnsi="Arial Narrow" w:cs="Calibri Light"/>
-          <w:b/>
-          <w:bCs/>
-          <w:noProof/>
-          <w:sz w:val="28"/>
-          <w:szCs w:val="28"/>
-        </w:rPr>
-        <w:t>991823967</w:t>
-      </w:r>
-      <w:r>
-        <w:rPr>
-          <w:rFonts w:ascii="Arial Narrow" w:hAnsi="Arial Narrow" w:cs="Calibri Light"/>
-          <w:b/>
-          <w:bCs/>
-          <w:sz w:val="28"/>
-          <w:szCs w:val="28"/>
-        </w:rPr>
-        <w:t xml:space="preserve"> </w:t>
-      </w:r>
-    </w:p>
-    <w:p>
-      <w:pPr>
-        <w:rPr>
-          <w:rFonts w:ascii="Arial Narrow" w:hAnsi="Arial Narrow" w:cs="Calibri Light"/>
-          <w:b/>
-          <w:bCs/>
-          <w:sz w:val="28"/>
-          <w:szCs w:val="28"/>
-        </w:rPr>
-      </w:pPr>
-      <w:r>
-        <w:rPr>
-          <w:rFonts w:ascii="Arial Narrow" w:hAnsi="Arial Narrow" w:cs="Calibri Light"/>
-          <w:b/>
-          <w:bCs/>
-          <w:sz w:val="28"/>
-          <w:szCs w:val="28"/>
-        </w:rPr>
-        <w:t xml:space="preserve">Fecha de pago: </w:t>
-      </w:r>
-      <w:r>
-        <w:rPr>
-          <w:rFonts w:ascii="Arial Narrow" w:hAnsi="Arial Narrow" w:cs="Calibri Light"/>
-          <w:b/>
-          <w:bCs/>
-          <w:noProof/>
-          <w:sz w:val="28"/>
-          <w:szCs w:val="28"/>
-        </w:rPr>
-        <w:t>7/13/2026</w:t>
-      </w:r>
-      <w:r>
-        <w:rPr>
-          <w:rFonts w:ascii="Arial Narrow" w:hAnsi="Arial Narrow" w:cs="Calibri Light"/>
-          <w:b/>
-          <w:bCs/>
-          <w:sz w:val="28"/>
-          <w:szCs w:val="28"/>
-        </w:rPr>
-        <w:tab/>
-      </w:r>
-      <w:r>
-        <w:rPr>
-          <w:rFonts w:ascii="Arial Narrow" w:hAnsi="Arial Narrow" w:cs="Calibri Light"/>
-          <w:b/>
-          <w:bCs/>
-          <w:sz w:val="28"/>
-          <w:szCs w:val="28"/>
-        </w:rPr>
-        <w:tab/>
-      </w:r>
-      <w:r>
-        <w:rPr>
-          <w:rFonts w:ascii="Arial Narrow" w:hAnsi="Arial Narrow" w:cs="Calibri Light"/>
-          <w:b/>
-          <w:bCs/>
-          <w:sz w:val="28"/>
-          <w:szCs w:val="28"/>
-        </w:rPr>
-        <w:tab/>
-      </w:r>
-      <w:r>
-        <w:rPr>
-          <w:rFonts w:ascii="Arial Narrow" w:hAnsi="Arial Narrow" w:cs="Calibri Light"/>
-          <w:b/>
-          <w:bCs/>
-          <w:sz w:val="28"/>
-          <w:szCs w:val="28"/>
-        </w:rPr>
-        <w:tab/>
-      </w:r>
-      <w:r>
-        <w:rPr>
-          <w:rFonts w:ascii="Arial Narrow" w:hAnsi="Arial Narrow" w:cs="Calibri Light"/>
-          <w:b/>
-          <w:bCs/>
-          <w:sz w:val="28"/>
-          <w:szCs w:val="28"/>
-        </w:rPr>
-        <w:tab/>
-      </w:r>
-      <w:r>
-        <w:rPr>
-          <w:rFonts w:ascii="Arial Narrow" w:hAnsi="Arial Narrow" w:cs="Calibri Light"/>
-          <w:b/>
-          <w:bCs/>
-          <w:sz w:val="28"/>
-          <w:szCs w:val="28"/>
-        </w:rPr>
-        <w:tab/>
-      </w:r>
-      <w:r>
-        <w:rPr>
-          <w:rFonts w:ascii="Arial Narrow" w:hAnsi="Arial Narrow" w:cs="Calibri Light"/>
-          <w:b/>
-          <w:bCs/>
-          <w:sz w:val="28"/>
-          <w:szCs w:val="28"/>
-        </w:rPr>
-        <w:tab/>
-      </w:r>
-      <w:r>
-        <w:rPr>
-          <w:rFonts w:ascii="Arial Narrow" w:hAnsi="Arial Narrow" w:cs="Calibri Light"/>
-          <w:b/>
-          <w:bCs/>
-          <w:sz w:val="28"/>
-          <w:szCs w:val="28"/>
-        </w:rPr>
-        <w:tab/>
-      </w:r>
-    </w:p>
-    <w:p>
-      <w:pPr>
-        <w:jc w:val="center"/>
-      </w:pPr>
-    </w:p>
-    <w:p>
-      <w:pPr>
-        <w:rPr>
-          <w:lang w:eastAsia="es-ES"/>
-        </w:rPr>
-        <w:sectPr>
-          <w:headerReference w:type="default" r:id="rId8"/>
-          <w:pgSz w:w="11906" w:h="16838"/>
-          <w:pgMar w:top="284" w:right="1133" w:bottom="142" w:left="709" w:header="708" w:footer="708" w:gutter="0"/>
-          <w:pgNumType w:start="1"/>
-          <w:cols w:space="708"/>
-          <w:docGrid w:linePitch="360"/>
-        </w:sectPr>
-      </w:pPr>
-    </w:p>
-    <w:p>
-      <w:pPr>
-        <w:rPr>
-          <w:lang w:eastAsia="es-ES"/>
-        </w:rPr>
-      </w:pPr>
+          <w:sz w:val="28"/>
+          <w:szCs w:val="28"/>
+        </w:rPr>
+      </w:pPr>
+      <w:r/>
     </w:p>
     <w:p>
       <w:r>

</xml_diff>